<commit_message>
style: refine research abstract layout with invisible table and bold headings
</commit_message>
<xml_diff>
--- a/assets/templates/template_academic_research.docx
+++ b/assets/templates/template_academic_research.docx
@@ -291,50 +291,186 @@
         </w:sectPr>
       </w:pPr>
     </w:p>
-    <w:p>
-      <w:pPr>
-        <w:pStyle w:val="AcademicBodyNoIndent"/>
-      </w:pPr>
-      <w:r>
-        <w:rPr>
-          <w:rStyle w:val="NormalFont"/>
-        </w:rPr>
-        <w:t xml:space="preserve">หัวข้อการค้นคว้าอิสระ: ${report_title}</w:t>
-      </w:r>
-    </w:p>
-    <w:p>
-      <w:pPr>
-        <w:pStyle w:val="AcademicBodyNoIndent"/>
-      </w:pPr>
-      <w:r>
-        <w:rPr>
-          <w:rStyle w:val="NormalFont"/>
-        </w:rPr>
-        <w:t xml:space="preserve">ผู้เขียน: ${report_author}</w:t>
-      </w:r>
-    </w:p>
-    <w:p>
-      <w:pPr>
-        <w:pStyle w:val="AcademicBodyNoIndent"/>
-      </w:pPr>
-      <w:r>
-        <w:rPr>
-          <w:rStyle w:val="NormalFont"/>
-        </w:rPr>
-        <w:t xml:space="preserve">ปริญญา: ${report_degree} ${report_major}</w:t>
-      </w:r>
-    </w:p>
-    <w:p>
-      <w:pPr>
-        <w:pStyle w:val="AcademicBodyNoIndent"/>
-      </w:pPr>
-      <w:r>
-        <w:rPr>
-          <w:rStyle w:val="NormalFont"/>
-        </w:rPr>
-        <w:t xml:space="preserve">อาจารย์ที่ปรึกษา: ${report_instructor}</w:t>
-      </w:r>
-    </w:p>
+    <w:tbl>
+      <w:tblGrid>
+        <w:gridCol w:w="3000" w:type="dxa"/>
+        <w:gridCol w:w="6200" w:type="dxa"/>
+      </w:tblGrid>
+      <w:tblPr>
+        <w:tblW w:w="0" w:type="auto"/>
+        <w:tblLayout w:type="autofit"/>
+        <w:tblCellMar>
+          <w:top w:w="0" w:type="dxa"/>
+          <w:left w:w="0" w:type="dxa"/>
+          <w:right w:w="0" w:type="dxa"/>
+          <w:bottom w:w="0" w:type="dxa"/>
+        </w:tblCellMar>
+        <w:tblBorders>
+          <w:top w:val="single" w:sz="0" w:color="FFFFFF"/>
+          <w:left w:val="single" w:sz="0" w:color="FFFFFF"/>
+          <w:right w:val="single" w:sz="0" w:color="FFFFFF"/>
+          <w:bottom w:val="single" w:sz="0" w:color="FFFFFF"/>
+          <w:insideH w:val="single" w:sz="0" w:color="FFFFFF"/>
+          <w:insideV w:val="single" w:sz="0" w:color="FFFFFF"/>
+        </w:tblBorders>
+      </w:tblPr>
+      <w:tr>
+        <w:trPr/>
+        <w:tc>
+          <w:tcPr>
+            <w:tcW w:w="3000" w:type="dxa"/>
+            <w:noWrap/>
+          </w:tcPr>
+          <w:p>
+            <w:pPr>
+              <w:jc w:val="left"/>
+              <w:spacing w:after="60"/>
+            </w:pPr>
+            <w:r>
+              <w:rPr>
+                <w:rStyle w:val="NormalBoldFont"/>
+              </w:rPr>
+              <w:t xml:space="preserve">ชื่อเรื่องการศึกษาอิสระ</w:t>
+            </w:r>
+          </w:p>
+        </w:tc>
+        <w:tc>
+          <w:tcPr>
+            <w:tcW w:w="6200" w:type="dxa"/>
+            <w:noWrap/>
+          </w:tcPr>
+          <w:p>
+            <w:pPr>
+              <w:jc w:val="left"/>
+              <w:spacing w:after="60"/>
+            </w:pPr>
+            <w:r>
+              <w:rPr>
+                <w:rStyle w:val="NormalFont"/>
+              </w:rPr>
+              <w:t xml:space="preserve">${report_title}</w:t>
+            </w:r>
+          </w:p>
+        </w:tc>
+      </w:tr>
+      <w:tr>
+        <w:trPr/>
+        <w:tc>
+          <w:tcPr>
+            <w:tcW w:w="3000" w:type="dxa"/>
+            <w:noWrap/>
+          </w:tcPr>
+          <w:p>
+            <w:pPr>
+              <w:jc w:val="left"/>
+              <w:spacing w:after="60"/>
+            </w:pPr>
+            <w:r>
+              <w:rPr>
+                <w:rStyle w:val="NormalBoldFont"/>
+              </w:rPr>
+              <w:t xml:space="preserve">ผู้เขียน</w:t>
+            </w:r>
+          </w:p>
+        </w:tc>
+        <w:tc>
+          <w:tcPr>
+            <w:tcW w:w="6200" w:type="dxa"/>
+            <w:noWrap/>
+          </w:tcPr>
+          <w:p>
+            <w:pPr>
+              <w:jc w:val="left"/>
+              <w:spacing w:after="60"/>
+            </w:pPr>
+            <w:r>
+              <w:rPr>
+                <w:rStyle w:val="NormalFont"/>
+              </w:rPr>
+              <w:t xml:space="preserve">${report_author}</w:t>
+            </w:r>
+          </w:p>
+        </w:tc>
+      </w:tr>
+      <w:tr>
+        <w:trPr/>
+        <w:tc>
+          <w:tcPr>
+            <w:tcW w:w="3000" w:type="dxa"/>
+            <w:noWrap/>
+          </w:tcPr>
+          <w:p>
+            <w:pPr>
+              <w:jc w:val="left"/>
+              <w:spacing w:after="60"/>
+            </w:pPr>
+            <w:r>
+              <w:rPr>
+                <w:rStyle w:val="NormalBoldFont"/>
+              </w:rPr>
+              <w:t xml:space="preserve">ปริญญา</w:t>
+            </w:r>
+          </w:p>
+        </w:tc>
+        <w:tc>
+          <w:tcPr>
+            <w:tcW w:w="6200" w:type="dxa"/>
+            <w:noWrap/>
+          </w:tcPr>
+          <w:p>
+            <w:pPr>
+              <w:jc w:val="left"/>
+              <w:spacing w:after="60"/>
+            </w:pPr>
+            <w:r>
+              <w:rPr>
+                <w:rStyle w:val="NormalFont"/>
+              </w:rPr>
+              <w:t xml:space="preserve">${report_degree} ${report_major}</w:t>
+            </w:r>
+          </w:p>
+        </w:tc>
+      </w:tr>
+      <w:tr>
+        <w:trPr/>
+        <w:tc>
+          <w:tcPr>
+            <w:tcW w:w="3000" w:type="dxa"/>
+            <w:noWrap/>
+          </w:tcPr>
+          <w:p>
+            <w:pPr>
+              <w:jc w:val="left"/>
+              <w:spacing w:after="60"/>
+            </w:pPr>
+            <w:r>
+              <w:rPr>
+                <w:rStyle w:val="NormalBoldFont"/>
+              </w:rPr>
+              <w:t xml:space="preserve">อาจารย์ที่ปรึกษา</w:t>
+            </w:r>
+          </w:p>
+        </w:tc>
+        <w:tc>
+          <w:tcPr>
+            <w:tcW w:w="6200" w:type="dxa"/>
+            <w:noWrap/>
+          </w:tcPr>
+          <w:p>
+            <w:pPr>
+              <w:jc w:val="left"/>
+              <w:spacing w:after="60"/>
+            </w:pPr>
+            <w:r>
+              <w:rPr>
+                <w:rStyle w:val="NormalFont"/>
+              </w:rPr>
+              <w:t xml:space="preserve">${report_instructor}</w:t>
+            </w:r>
+          </w:p>
+        </w:tc>
+      </w:tr>
+    </w:tbl>
     <w:p/>
     <w:p>
       <w:pPr>
@@ -345,43 +481,6 @@
           <w:rStyle w:val="PrefaceTitleFont"/>
         </w:rPr>
         <w:t xml:space="preserve">บทคัดย่อ</w:t>
-      </w:r>
-    </w:p>
-    <w:p/>
-    <w:p>
-      <w:pPr/>
-      <w:r>
-        <w:rPr/>
-        <w:t xml:space="preserve">${abs_th_paras}</w:t>
-      </w:r>
-    </w:p>
-    <w:p>
-      <w:pPr>
-        <w:pStyle w:val="AcademicBody"/>
-      </w:pPr>
-      <w:r>
-        <w:rPr>
-          <w:rStyle w:val="NormalFont"/>
-        </w:rPr>
-        <w:t xml:space="preserve">${abs_th_text}</w:t>
-      </w:r>
-    </w:p>
-    <w:p>
-      <w:pPr/>
-      <w:r>
-        <w:rPr/>
-        <w:t xml:space="preserve">${/abs_th_paras}</w:t>
-      </w:r>
-    </w:p>
-    <w:p>
-      <w:pPr>
-        <w:pStyle w:val="AcademicBodyNoIndent"/>
-      </w:pPr>
-      <w:r>
-        <w:rPr>
-          <w:rStyle w:val="NormalFont"/>
-        </w:rPr>
-        <w:t xml:space="preserve">คำสำคัญ: ${abstract_thai_keywords}</w:t>
       </w:r>
     </w:p>
     <w:p>
@@ -393,50 +492,186 @@
         </w:sectPr>
       </w:pPr>
     </w:p>
-    <w:p>
-      <w:pPr>
-        <w:pStyle w:val="AcademicBodyNoIndent"/>
-      </w:pPr>
-      <w:r>
-        <w:rPr>
-          <w:rStyle w:val="NormalFont"/>
-        </w:rPr>
-        <w:t xml:space="preserve">Independent Study Title: ${report_title_en}</w:t>
-      </w:r>
-    </w:p>
-    <w:p>
-      <w:pPr>
-        <w:pStyle w:val="AcademicBodyNoIndent"/>
-      </w:pPr>
-      <w:r>
-        <w:rPr>
-          <w:rStyle w:val="NormalFont"/>
-        </w:rPr>
-        <w:t xml:space="preserve">Author: ${report_author_en}</w:t>
-      </w:r>
-    </w:p>
-    <w:p>
-      <w:pPr>
-        <w:pStyle w:val="AcademicBodyNoIndent"/>
-      </w:pPr>
-      <w:r>
-        <w:rPr>
-          <w:rStyle w:val="NormalFont"/>
-        </w:rPr>
-        <w:t xml:space="preserve">Degree: ${report_degree_en} ${report_major_en}</w:t>
-      </w:r>
-    </w:p>
-    <w:p>
-      <w:pPr>
-        <w:pStyle w:val="AcademicBodyNoIndent"/>
-      </w:pPr>
-      <w:r>
-        <w:rPr>
-          <w:rStyle w:val="NormalFont"/>
-        </w:rPr>
-        <w:t xml:space="preserve">Advisor: ${report_instructor_en}</w:t>
-      </w:r>
-    </w:p>
+    <w:tbl>
+      <w:tblGrid>
+        <w:gridCol w:w="3000" w:type="dxa"/>
+        <w:gridCol w:w="6200" w:type="dxa"/>
+      </w:tblGrid>
+      <w:tblPr>
+        <w:tblW w:w="0" w:type="auto"/>
+        <w:tblLayout w:type="autofit"/>
+        <w:tblCellMar>
+          <w:top w:w="0" w:type="dxa"/>
+          <w:left w:w="0" w:type="dxa"/>
+          <w:right w:w="0" w:type="dxa"/>
+          <w:bottom w:w="0" w:type="dxa"/>
+        </w:tblCellMar>
+        <w:tblBorders>
+          <w:top w:val="single" w:sz="0" w:color="FFFFFF"/>
+          <w:left w:val="single" w:sz="0" w:color="FFFFFF"/>
+          <w:right w:val="single" w:sz="0" w:color="FFFFFF"/>
+          <w:bottom w:val="single" w:sz="0" w:color="FFFFFF"/>
+          <w:insideH w:val="single" w:sz="0" w:color="FFFFFF"/>
+          <w:insideV w:val="single" w:sz="0" w:color="FFFFFF"/>
+        </w:tblBorders>
+      </w:tblPr>
+      <w:tr>
+        <w:trPr/>
+        <w:tc>
+          <w:tcPr>
+            <w:tcW w:w="3000" w:type="dxa"/>
+            <w:noWrap/>
+          </w:tcPr>
+          <w:p>
+            <w:pPr>
+              <w:jc w:val="left"/>
+              <w:spacing w:after="60"/>
+            </w:pPr>
+            <w:r>
+              <w:rPr>
+                <w:rStyle w:val="NormalBoldFont"/>
+              </w:rPr>
+              <w:t xml:space="preserve">Independent Study Title</w:t>
+            </w:r>
+          </w:p>
+        </w:tc>
+        <w:tc>
+          <w:tcPr>
+            <w:tcW w:w="6200" w:type="dxa"/>
+            <w:noWrap/>
+          </w:tcPr>
+          <w:p>
+            <w:pPr>
+              <w:jc w:val="left"/>
+              <w:spacing w:after="60"/>
+            </w:pPr>
+            <w:r>
+              <w:rPr>
+                <w:rStyle w:val="NormalFont"/>
+              </w:rPr>
+              <w:t xml:space="preserve">${report_title_en}</w:t>
+            </w:r>
+          </w:p>
+        </w:tc>
+      </w:tr>
+      <w:tr>
+        <w:trPr/>
+        <w:tc>
+          <w:tcPr>
+            <w:tcW w:w="3000" w:type="dxa"/>
+            <w:noWrap/>
+          </w:tcPr>
+          <w:p>
+            <w:pPr>
+              <w:jc w:val="left"/>
+              <w:spacing w:after="60"/>
+            </w:pPr>
+            <w:r>
+              <w:rPr>
+                <w:rStyle w:val="NormalBoldFont"/>
+              </w:rPr>
+              <w:t xml:space="preserve">Author</w:t>
+            </w:r>
+          </w:p>
+        </w:tc>
+        <w:tc>
+          <w:tcPr>
+            <w:tcW w:w="6200" w:type="dxa"/>
+            <w:noWrap/>
+          </w:tcPr>
+          <w:p>
+            <w:pPr>
+              <w:jc w:val="left"/>
+              <w:spacing w:after="60"/>
+            </w:pPr>
+            <w:r>
+              <w:rPr>
+                <w:rStyle w:val="NormalFont"/>
+              </w:rPr>
+              <w:t xml:space="preserve">${report_author_en}</w:t>
+            </w:r>
+          </w:p>
+        </w:tc>
+      </w:tr>
+      <w:tr>
+        <w:trPr/>
+        <w:tc>
+          <w:tcPr>
+            <w:tcW w:w="3000" w:type="dxa"/>
+            <w:noWrap/>
+          </w:tcPr>
+          <w:p>
+            <w:pPr>
+              <w:jc w:val="left"/>
+              <w:spacing w:after="60"/>
+            </w:pPr>
+            <w:r>
+              <w:rPr>
+                <w:rStyle w:val="NormalBoldFont"/>
+              </w:rPr>
+              <w:t xml:space="preserve">Degree</w:t>
+            </w:r>
+          </w:p>
+        </w:tc>
+        <w:tc>
+          <w:tcPr>
+            <w:tcW w:w="6200" w:type="dxa"/>
+            <w:noWrap/>
+          </w:tcPr>
+          <w:p>
+            <w:pPr>
+              <w:jc w:val="left"/>
+              <w:spacing w:after="60"/>
+            </w:pPr>
+            <w:r>
+              <w:rPr>
+                <w:rStyle w:val="NormalFont"/>
+              </w:rPr>
+              <w:t xml:space="preserve">${report_degree_en} ${report_major_en}</w:t>
+            </w:r>
+          </w:p>
+        </w:tc>
+      </w:tr>
+      <w:tr>
+        <w:trPr/>
+        <w:tc>
+          <w:tcPr>
+            <w:tcW w:w="3000" w:type="dxa"/>
+            <w:noWrap/>
+          </w:tcPr>
+          <w:p>
+            <w:pPr>
+              <w:jc w:val="left"/>
+              <w:spacing w:after="60"/>
+            </w:pPr>
+            <w:r>
+              <w:rPr>
+                <w:rStyle w:val="NormalBoldFont"/>
+              </w:rPr>
+              <w:t xml:space="preserve">Advisor</w:t>
+            </w:r>
+          </w:p>
+        </w:tc>
+        <w:tc>
+          <w:tcPr>
+            <w:tcW w:w="6200" w:type="dxa"/>
+            <w:noWrap/>
+          </w:tcPr>
+          <w:p>
+            <w:pPr>
+              <w:jc w:val="left"/>
+              <w:spacing w:after="60"/>
+            </w:pPr>
+            <w:r>
+              <w:rPr>
+                <w:rStyle w:val="NormalFont"/>
+              </w:rPr>
+              <w:t xml:space="preserve">${report_instructor_en}</w:t>
+            </w:r>
+          </w:p>
+        </w:tc>
+      </w:tr>
+    </w:tbl>
     <w:p/>
     <w:p>
       <w:pPr>
@@ -447,43 +682,6 @@
           <w:rStyle w:val="PrefaceTitleFont"/>
         </w:rPr>
         <w:t xml:space="preserve">ABSTRACT</w:t>
-      </w:r>
-    </w:p>
-    <w:p/>
-    <w:p>
-      <w:pPr/>
-      <w:r>
-        <w:rPr/>
-        <w:t xml:space="preserve">${abs_en_paras}</w:t>
-      </w:r>
-    </w:p>
-    <w:p>
-      <w:pPr>
-        <w:pStyle w:val="AcademicBody"/>
-      </w:pPr>
-      <w:r>
-        <w:rPr>
-          <w:rStyle w:val="NormalFont"/>
-        </w:rPr>
-        <w:t xml:space="preserve">${abs_en_text}</w:t>
-      </w:r>
-    </w:p>
-    <w:p>
-      <w:pPr/>
-      <w:r>
-        <w:rPr/>
-        <w:t xml:space="preserve">${/abs_en_paras}</w:t>
-      </w:r>
-    </w:p>
-    <w:p>
-      <w:pPr>
-        <w:pStyle w:val="AcademicBodyNoIndent"/>
-      </w:pPr>
-      <w:r>
-        <w:rPr>
-          <w:rStyle w:val="NormalFont"/>
-        </w:rPr>
-        <w:t xml:space="preserve">Keywords: ${abstract_english_keywords}</w:t>
       </w:r>
     </w:p>
     <w:p>
@@ -1090,7 +1288,7 @@
     <w:name w:val="AcademicBodyNoIndent"/>
     <w:basedOn w:val="Normal"/>
     <w:pPr>
-      <w:jc w:val="thaiDistribute"/>
+      <w:jc w:val="left"/>
       <w:ind w:left="0" w:right="0" w:firstLine="0" w:hanging="0"/>
       <w:spacing w:after="120" w:line="360" w:lineRule="auto"/>
     </w:pPr>
@@ -1205,11 +1403,21 @@
     </w:rPr>
   </w:style>
   <w:style w:type="character">
+    <w:name w:val="NormalBoldFont"/>
+    <w:rPr>
+      <w:rFonts w:ascii="TH Sarabun New" w:hAnsi="TH Sarabun New" w:eastAsia="TH Sarabun New" w:cs="TH Sarabun New" w:hint="cs"/>
+      <w:sz w:val="32"/>
+      <w:szCs w:val="32"/>
+      <w:b w:val="1"/>
+      <w:bCs w:val="1"/>
+    </w:rPr>
+  </w:style>
+  <w:style w:type="character">
     <w:name w:val="PrefaceTitleFont"/>
     <w:rPr>
       <w:rFonts w:ascii="TH Sarabun New" w:hAnsi="TH Sarabun New" w:eastAsia="TH Sarabun New" w:cs="TH Sarabun New" w:hint="cs"/>
-      <w:sz w:val="40"/>
-      <w:szCs w:val="40"/>
+      <w:sz w:val="36"/>
+      <w:szCs w:val="36"/>
       <w:b w:val="1"/>
       <w:bCs w:val="1"/>
     </w:rPr>

</xml_diff>

<commit_message>
style: finalize research report layout with correct TOC pagination, alignment, and list headers
</commit_message>
<xml_diff>
--- a/assets/templates/template_academic_research.docx
+++ b/assets/templates/template_academic_research.docx
@@ -712,7 +712,14 @@
         <w:rPr>
           <w:rStyle w:val="TOCLabelFont"/>
         </w:rPr>
-        <w:t xml:space="preserve">หน้า</w:t>
+        <w:t xml:space="preserve">	หน้า</w:t>
+      </w:r>
+    </w:p>
+    <w:p>
+      <w:pPr/>
+      <w:r>
+        <w:rPr/>
+        <w:t xml:space="preserve">${toc_p1_block}</w:t>
       </w:r>
     </w:p>
     <w:p>
@@ -723,156 +730,14 @@
         <w:rPr>
           <w:rStyle w:val="NormalFont"/>
         </w:rPr>
-        <w:t xml:space="preserve">กิตติกรรมประกาศ	${toc_page_ack}</w:t>
-      </w:r>
-    </w:p>
-    <w:p>
-      <w:pPr>
-        <w:pStyle w:val="TOCParaItem"/>
-      </w:pPr>
-      <w:r>
-        <w:rPr>
-          <w:rStyle w:val="NormalFont"/>
-        </w:rPr>
-        <w:t xml:space="preserve">บทคัดย่อภาษาไทย	${toc_page_abs_th}</w:t>
-      </w:r>
-    </w:p>
-    <w:p>
-      <w:pPr>
-        <w:pStyle w:val="TOCParaItem"/>
-      </w:pPr>
-      <w:r>
-        <w:rPr>
-          <w:rStyle w:val="NormalFont"/>
-        </w:rPr>
-        <w:t xml:space="preserve">ABSTRACT	${toc_page_abs_en}</w:t>
-      </w:r>
-    </w:p>
-    <w:p>
-      <w:pPr>
-        <w:pStyle w:val="TOCParaItem"/>
-      </w:pPr>
-      <w:r>
-        <w:rPr>
-          <w:rStyle w:val="NormalFont"/>
-        </w:rPr>
-        <w:t xml:space="preserve">สารบัญ	${toc_page_toc}</w:t>
-      </w:r>
-    </w:p>
-    <w:p>
-      <w:pPr>
-        <w:pStyle w:val="TOCParaItem"/>
-      </w:pPr>
-      <w:r>
-        <w:rPr>
-          <w:rStyle w:val="NormalFont"/>
-        </w:rPr>
-        <w:t xml:space="preserve">สารบัญภาพ	${toc_page_figs}</w:t>
-      </w:r>
-    </w:p>
-    <w:p>
-      <w:pPr>
-        <w:pStyle w:val="TOCParaItem"/>
-      </w:pPr>
-      <w:r>
-        <w:rPr>
-          <w:rStyle w:val="NormalFont"/>
-        </w:rPr>
-        <w:t xml:space="preserve">สารบัญตาราง	${toc_page_tabs}</w:t>
-      </w:r>
-    </w:p>
-    <w:p>
-      <w:pPr/>
-      <w:r>
-        <w:rPr/>
-        <w:t xml:space="preserve">${toc_chapters}</w:t>
-      </w:r>
-    </w:p>
-    <w:p>
-      <w:pPr>
-        <w:pStyle w:val="TOCParaItem"/>
-      </w:pPr>
-      <w:r>
-        <w:rPr>
-          <w:rStyle w:val="NormalFont"/>
-        </w:rPr>
-        <w:t xml:space="preserve">บทที่ ${toc_chapter_number} ${toc_chapter_title}	${toc_chapter_page}</w:t>
-      </w:r>
-    </w:p>
-    <w:p>
-      <w:pPr/>
-      <w:r>
-        <w:rPr/>
-        <w:t xml:space="preserve">${toc_subsections}</w:t>
-      </w:r>
-    </w:p>
-    <w:p>
-      <w:pPr>
-        <w:pStyle w:val="TOCParaSubItem"/>
-      </w:pPr>
-      <w:r>
-        <w:rPr>
-          <w:rStyle w:val="NormalFont"/>
-        </w:rPr>
-        <w:t xml:space="preserve">${toc_chapter_number}.${toc_subsection_index} ${toc_subsection_title}	${toc_subsection_page}</w:t>
-      </w:r>
-    </w:p>
-    <w:p>
-      <w:pPr/>
-      <w:r>
-        <w:rPr/>
-        <w:t xml:space="preserve">${/toc_subsections}</w:t>
-      </w:r>
-    </w:p>
-    <w:p>
-      <w:pPr/>
-      <w:r>
-        <w:rPr/>
-        <w:t xml:space="preserve">${/toc_chapters}</w:t>
-      </w:r>
-    </w:p>
-    <w:p>
-      <w:pPr>
-        <w:pStyle w:val="TOCParaItem"/>
-      </w:pPr>
-      <w:r>
-        <w:rPr>
-          <w:rStyle w:val="NormalFont"/>
-        </w:rPr>
-        <w:t xml:space="preserve">บรรณานุกรม	${toc_page_bib}</w:t>
-      </w:r>
-    </w:p>
-    <w:p>
-      <w:pPr>
-        <w:pStyle w:val="TOCParaItem"/>
-      </w:pPr>
-      <w:r>
-        <w:rPr>
-          <w:rStyle w:val="NormalFont"/>
-        </w:rPr>
-        <w:t xml:space="preserve">ภาคผนวก ก	${toc_page_app_a}</w:t>
-      </w:r>
-    </w:p>
-    <w:p>
-      <w:pPr>
-        <w:pStyle w:val="TOCParaItem"/>
-      </w:pPr>
-      <w:r>
-        <w:rPr>
-          <w:rStyle w:val="NormalFont"/>
-        </w:rPr>
-        <w:t xml:space="preserve">ภาคผนวก ข	${toc_page_app_b}</w:t>
-      </w:r>
-    </w:p>
-    <w:p>
-      <w:pPr>
-        <w:pStyle w:val="TOCParaItem"/>
-      </w:pPr>
-      <w:r>
-        <w:rPr>
-          <w:rStyle w:val="NormalFont"/>
-        </w:rPr>
-        <w:t xml:space="preserve">ประวัติผู้วิจัย	${toc_page_bio}</w:t>
+        <w:t xml:space="preserve">${toc_p1_indent}${toc_p1_text}${toc_p1_sep}${toc_p1_page}</w:t>
+      </w:r>
+    </w:p>
+    <w:p>
+      <w:pPr/>
+      <w:r>
+        <w:rPr/>
+        <w:t xml:space="preserve">${/toc_p1_block}</w:t>
       </w:r>
     </w:p>
     <w:p>
@@ -885,6 +750,13 @@
       </w:pPr>
     </w:p>
     <w:p>
+      <w:pPr/>
+      <w:r>
+        <w:rPr/>
+        <w:t xml:space="preserve">${toc_p2_visible}</w:t>
+      </w:r>
+    </w:p>
+    <w:p>
       <w:pPr>
         <w:pStyle w:val="TOCParaTitle"/>
       </w:pPr>
@@ -892,7 +764,7 @@
         <w:rPr>
           <w:rStyle w:val="PrefaceTitleFont"/>
         </w:rPr>
-        <w:t xml:space="preserve">สารบัญภาพ</w:t>
+        <w:t xml:space="preserve">สารบัญ (ต่อ)</w:t>
       </w:r>
     </w:p>
     <w:p>
@@ -903,14 +775,14 @@
         <w:rPr>
           <w:rStyle w:val="TOCLabelFont"/>
         </w:rPr>
-        <w:t xml:space="preserve">หน้า</w:t>
-      </w:r>
-    </w:p>
-    <w:p>
-      <w:pPr/>
-      <w:r>
-        <w:rPr/>
-        <w:t xml:space="preserve">${figures_entries}</w:t>
+        <w:t xml:space="preserve">	หน้า</w:t>
+      </w:r>
+    </w:p>
+    <w:p>
+      <w:pPr/>
+      <w:r>
+        <w:rPr/>
+        <w:t xml:space="preserve">${toc_p2_block}</w:t>
       </w:r>
     </w:p>
     <w:p>
@@ -921,14 +793,21 @@
         <w:rPr>
           <w:rStyle w:val="NormalFont"/>
         </w:rPr>
-        <w:t xml:space="preserve">ภาพที่ ${fig_number} ${fig_title}	${fig_page}</w:t>
-      </w:r>
-    </w:p>
-    <w:p>
-      <w:pPr/>
-      <w:r>
-        <w:rPr/>
-        <w:t xml:space="preserve">${/figures_entries}</w:t>
+        <w:t xml:space="preserve">${toc_p2_indent}${toc_p2_text}${toc_p2_sep}${toc_p2_page}</w:t>
+      </w:r>
+    </w:p>
+    <w:p>
+      <w:pPr/>
+      <w:r>
+        <w:rPr/>
+        <w:t xml:space="preserve">${/toc_p2_block}</w:t>
+      </w:r>
+    </w:p>
+    <w:p>
+      <w:pPr/>
+      <w:r>
+        <w:rPr/>
+        <w:t xml:space="preserve">${/toc_p2_visible}</w:t>
       </w:r>
     </w:p>
     <w:p>
@@ -948,6 +827,62 @@
         <w:rPr>
           <w:rStyle w:val="PrefaceTitleFont"/>
         </w:rPr>
+        <w:t xml:space="preserve">สารบัญภาพ</w:t>
+      </w:r>
+    </w:p>
+    <w:p>
+      <w:pPr>
+        <w:pStyle w:val="TOCParaLabel"/>
+      </w:pPr>
+      <w:r>
+        <w:rPr>
+          <w:rStyle w:val="TOCLabelFont"/>
+        </w:rPr>
+        <w:t xml:space="preserve">ภาพที่	หน้า</w:t>
+      </w:r>
+    </w:p>
+    <w:p>
+      <w:pPr/>
+      <w:r>
+        <w:rPr/>
+        <w:t xml:space="preserve">${figures_entries}</w:t>
+      </w:r>
+    </w:p>
+    <w:p>
+      <w:pPr>
+        <w:pStyle w:val="TOCParaItem"/>
+      </w:pPr>
+      <w:r>
+        <w:rPr>
+          <w:rStyle w:val="NormalFont"/>
+        </w:rPr>
+        <w:t xml:space="preserve">ภาพที่ ${fig_number} ${fig_title}	${fig_page}</w:t>
+      </w:r>
+    </w:p>
+    <w:p>
+      <w:pPr/>
+      <w:r>
+        <w:rPr/>
+        <w:t xml:space="preserve">${/figures_entries}</w:t>
+      </w:r>
+    </w:p>
+    <w:p>
+      <w:pPr>
+        <w:sectPr>
+          <w:pgSz w:orient="portrait" w:w="11905.511811023621703498065471649169921875" w:h="16837.7952755905498634092509746551513671875"/>
+          <w:pgMar w:top="2160" w:right="1440" w:bottom="1440" w:left="2160" w:header="720" w:footer="720" w:gutter="0"/>
+          <w:cols w:num="1" w:space="720"/>
+        </w:sectPr>
+      </w:pPr>
+    </w:p>
+    <w:p>
+      <w:pPr>
+        <w:pStyle w:val="TOCParaTitle"/>
+      </w:pPr>
+      <w:r>
+        <w:rPr>
+          <w:rStyle w:val="PrefaceTitleFont"/>
+        </w:rPr>
         <w:t xml:space="preserve">สารบัญตาราง</w:t>
       </w:r>
     </w:p>
@@ -959,7 +894,7 @@
         <w:rPr>
           <w:rStyle w:val="TOCLabelFont"/>
         </w:rPr>
-        <w:t xml:space="preserve">หน้า</w:t>
+        <w:t xml:space="preserve">ตารางที่	หน้า</w:t>
       </w:r>
     </w:p>
     <w:p>
@@ -1337,8 +1272,11 @@
     <w:name w:val="TOCParaLabel"/>
     <w:basedOn w:val="Normal"/>
     <w:pPr>
-      <w:jc w:val="right"/>
+      <w:jc w:val="left"/>
       <w:spacing w:line="240" w:lineRule="auto"/>
+      <w:tabs>
+        <w:tab w:val="center" w:leader="none" w:pos="8100"/>
+      </w:tabs>
     </w:pPr>
   </w:style>
   <w:style w:type="paragraph" w:customStyle="1" w:styleId="TOCParaItem">
@@ -1348,7 +1286,7 @@
       <w:jc w:val="left"/>
       <w:spacing w:line="240" w:lineRule="auto"/>
       <w:tabs>
-        <w:tab w:val="right" w:leader="none" w:pos="8400"/>
+        <w:tab w:val="center" w:leader="none" w:pos="8100"/>
       </w:tabs>
     </w:pPr>
   </w:style>

</xml_diff>

<commit_message>
style: standardize chapter headers and intro spacing for research report
</commit_message>
<xml_diff>
--- a/assets/templates/template_academic_research.docx
+++ b/assets/templates/template_academic_research.docx
@@ -483,6 +483,44 @@
         <w:t xml:space="preserve">บทคัดย่อ</w:t>
       </w:r>
     </w:p>
+    <w:p/>
+    <w:p>
+      <w:pPr/>
+      <w:r>
+        <w:rPr/>
+        <w:t xml:space="preserve">${abs_th_paras}</w:t>
+      </w:r>
+    </w:p>
+    <w:p>
+      <w:pPr>
+        <w:pStyle w:val="AcademicBody"/>
+      </w:pPr>
+      <w:r>
+        <w:rPr>
+          <w:rStyle w:val="NormalFont"/>
+        </w:rPr>
+        <w:t xml:space="preserve">${abs_th_text}</w:t>
+      </w:r>
+    </w:p>
+    <w:p>
+      <w:pPr/>
+      <w:r>
+        <w:rPr/>
+        <w:t xml:space="preserve">${/abs_th_paras}</w:t>
+      </w:r>
+    </w:p>
+    <w:p/>
+    <w:p>
+      <w:pPr>
+        <w:pStyle w:val="AcademicBodyNoIndent"/>
+      </w:pPr>
+      <w:r>
+        <w:rPr>
+          <w:rStyle w:val="NormalFont"/>
+        </w:rPr>
+        <w:t xml:space="preserve">คำสำคัญ: ${abstract_thai_keywords}</w:t>
+      </w:r>
+    </w:p>
     <w:p>
       <w:pPr>
         <w:sectPr>
@@ -684,6 +722,44 @@
         <w:t xml:space="preserve">ABSTRACT</w:t>
       </w:r>
     </w:p>
+    <w:p/>
+    <w:p>
+      <w:pPr/>
+      <w:r>
+        <w:rPr/>
+        <w:t xml:space="preserve">${abs_en_paras}</w:t>
+      </w:r>
+    </w:p>
+    <w:p>
+      <w:pPr>
+        <w:pStyle w:val="AcademicBody"/>
+      </w:pPr>
+      <w:r>
+        <w:rPr>
+          <w:rStyle w:val="NormalFont"/>
+        </w:rPr>
+        <w:t xml:space="preserve">${abs_en_text}</w:t>
+      </w:r>
+    </w:p>
+    <w:p>
+      <w:pPr/>
+      <w:r>
+        <w:rPr/>
+        <w:t xml:space="preserve">${/abs_en_paras}</w:t>
+      </w:r>
+    </w:p>
+    <w:p/>
+    <w:p>
+      <w:pPr>
+        <w:pStyle w:val="AcademicBodyNoIndent"/>
+      </w:pPr>
+      <w:r>
+        <w:rPr>
+          <w:rStyle w:val="NormalFont"/>
+        </w:rPr>
+        <w:t xml:space="preserve">Keywords: ${abstract_english_keywords}</w:t>
+      </w:r>
+    </w:p>
     <w:p>
       <w:pPr>
         <w:sectPr>
@@ -960,7 +1036,17 @@
         <w:t xml:space="preserve">${chapter_title}</w:t>
       </w:r>
     </w:p>
-    <w:p/>
+    <w:p>
+      <w:pPr>
+        <w:pStyle w:val="AcademicBody"/>
+      </w:pPr>
+      <w:r>
+        <w:rPr>
+          <w:rStyle w:val="NormalFont"/>
+        </w:rPr>
+        <w:t xml:space="preserve">${chapter_intro}</w:t>
+      </w:r>
+    </w:p>
     <w:p>
       <w:pPr/>
       <w:r>
@@ -975,8 +1061,8 @@
       <w:r>
         <w:rPr>
           <w:rFonts w:ascii="TH Sarabun New" w:hAnsi="TH Sarabun New" w:eastAsia="TH Sarabun New" w:cs="TH Sarabun New"/>
-          <w:sz w:val="32"/>
-          <w:szCs w:val="32"/>
+          <w:sz w:val="36"/>
+          <w:szCs w:val="36"/>
           <w:b w:val="1"/>
           <w:bCs w:val="1"/>
         </w:rPr>
@@ -1214,7 +1300,7 @@
     <w:name w:val="AcademicBody"/>
     <w:basedOn w:val="Normal"/>
     <w:pPr>
-      <w:jc w:val="thaiDistribute"/>
+      <w:jc w:val="left"/>
       <w:ind w:left="0" w:right="0" w:firstLine="740" w:hanging="0"/>
       <w:spacing w:after="120" w:line="360" w:lineRule="auto"/>
     </w:pPr>

</xml_diff>

<commit_message>
feat: implement Chapter 3 methodology and finalize formatting for research report preview and export
</commit_message>
<xml_diff>
--- a/assets/templates/template_academic_research.docx
+++ b/assets/templates/template_academic_research.docx
@@ -18,8 +18,6 @@
     <w:p/>
     <w:p/>
     <w:p/>
-    <w:p/>
-    <w:p/>
     <w:p>
       <w:pPr>
         <w:pStyle w:val="CoverPara"/>
@@ -48,7 +46,6 @@
     <w:p/>
     <w:p/>
     <w:p/>
-    <w:p/>
     <w:p>
       <w:pPr>
         <w:pStyle w:val="CoverPara"/>
@@ -96,7 +93,7 @@
     <w:p>
       <w:pPr>
         <w:sectPr>
-          <w:pgSz w:orient="portrait" w:w="11905.511811023621703498065471649169921875" w:h="16837.7952755905498634092509746551513671875"/>
+          <w:pgSz w:orient="portrait" w:w="11905.511811023622" w:h="16837.79527559055"/>
           <w:pgMar w:top="2160" w:right="1440" w:bottom="1440" w:left="2160" w:header="720" w:footer="720" w:gutter="0"/>
           <w:cols w:num="1" w:space="720"/>
         </w:sectPr>
@@ -116,7 +113,7 @@
     <w:p>
       <w:pPr>
         <w:sectPr>
-          <w:pgSz w:orient="portrait" w:w="11905.511811023621703498065471649169921875" w:h="16837.7952755905498634092509746551513671875"/>
+          <w:pgSz w:orient="portrait" w:w="11905.511811023622" w:h="16837.79527559055"/>
           <w:pgMar w:top="2160" w:right="1440" w:bottom="1440" w:left="2160" w:header="720" w:footer="720" w:gutter="0"/>
           <w:cols w:num="1" w:space="720"/>
         </w:sectPr>
@@ -138,8 +135,6 @@
     <w:p/>
     <w:p/>
     <w:p/>
-    <w:p/>
-    <w:p/>
     <w:p>
       <w:pPr>
         <w:pStyle w:val="CoverPara"/>
@@ -168,7 +163,6 @@
     <w:p/>
     <w:p/>
     <w:p/>
-    <w:p/>
     <w:p>
       <w:pPr>
         <w:pStyle w:val="CoverPara"/>
@@ -216,7 +210,7 @@
     <w:p>
       <w:pPr>
         <w:sectPr>
-          <w:pgSz w:orient="portrait" w:w="11905.511811023621703498065471649169921875" w:h="16837.7952755905498634092509746551513671875"/>
+          <w:pgSz w:orient="portrait" w:w="11905.511811023622" w:h="16837.79527559055"/>
           <w:pgMar w:top="2160" w:right="1440" w:bottom="1440" w:left="2160" w:header="720" w:footer="720" w:gutter="0"/>
           <w:cols w:num="1" w:space="720"/>
         </w:sectPr>
@@ -285,7 +279,7 @@
     <w:p>
       <w:pPr>
         <w:sectPr>
-          <w:pgSz w:orient="portrait" w:w="11905.511811023621703498065471649169921875" w:h="16837.7952755905498634092509746551513671875"/>
+          <w:pgSz w:orient="portrait" w:w="11905.511811023622" w:h="16837.79527559055"/>
           <w:pgMar w:top="2160" w:right="1440" w:bottom="1440" w:left="2160" w:header="720" w:footer="720" w:gutter="0"/>
           <w:cols w:num="1" w:space="720"/>
         </w:sectPr>
@@ -524,7 +518,7 @@
     <w:p>
       <w:pPr>
         <w:sectPr>
-          <w:pgSz w:orient="portrait" w:w="11905.511811023621703498065471649169921875" w:h="16837.7952755905498634092509746551513671875"/>
+          <w:pgSz w:orient="portrait" w:w="11905.511811023622" w:h="16837.79527559055"/>
           <w:pgMar w:top="2160" w:right="1440" w:bottom="1440" w:left="2160" w:header="720" w:footer="720" w:gutter="0"/>
           <w:cols w:num="1" w:space="720"/>
         </w:sectPr>
@@ -763,7 +757,7 @@
     <w:p>
       <w:pPr>
         <w:sectPr>
-          <w:pgSz w:orient="portrait" w:w="11905.511811023621703498065471649169921875" w:h="16837.7952755905498634092509746551513671875"/>
+          <w:pgSz w:orient="portrait" w:w="11905.511811023622" w:h="16837.79527559055"/>
           <w:pgMar w:top="2160" w:right="1440" w:bottom="1440" w:left="2160" w:header="720" w:footer="720" w:gutter="0"/>
           <w:cols w:num="1" w:space="720"/>
         </w:sectPr>
@@ -819,7 +813,7 @@
     <w:p>
       <w:pPr>
         <w:sectPr>
-          <w:pgSz w:orient="portrait" w:w="11905.511811023621703498065471649169921875" w:h="16837.7952755905498634092509746551513671875"/>
+          <w:pgSz w:orient="portrait" w:w="11905.511811023622" w:h="16837.79527559055"/>
           <w:pgMar w:top="2160" w:right="1440" w:bottom="1440" w:left="2160" w:header="720" w:footer="720" w:gutter="0"/>
           <w:cols w:num="1" w:space="720"/>
         </w:sectPr>
@@ -889,7 +883,7 @@
     <w:p>
       <w:pPr>
         <w:sectPr>
-          <w:pgSz w:orient="portrait" w:w="11905.511811023621703498065471649169921875" w:h="16837.7952755905498634092509746551513671875"/>
+          <w:pgSz w:orient="portrait" w:w="11905.511811023622" w:h="16837.79527559055"/>
           <w:pgMar w:top="2160" w:right="1440" w:bottom="1440" w:left="2160" w:header="720" w:footer="720" w:gutter="0"/>
           <w:cols w:num="1" w:space="720"/>
         </w:sectPr>
@@ -945,7 +939,7 @@
     <w:p>
       <w:pPr>
         <w:sectPr>
-          <w:pgSz w:orient="portrait" w:w="11905.511811023621703498065471649169921875" w:h="16837.7952755905498634092509746551513671875"/>
+          <w:pgSz w:orient="portrait" w:w="11905.511811023622" w:h="16837.79527559055"/>
           <w:pgMar w:top="2160" w:right="1440" w:bottom="1440" w:left="2160" w:header="720" w:footer="720" w:gutter="0"/>
           <w:cols w:num="1" w:space="720"/>
         </w:sectPr>
@@ -1001,7 +995,7 @@
     <w:p>
       <w:pPr>
         <w:sectPr>
-          <w:pgSz w:orient="portrait" w:w="11905.511811023621703498065471649169921875" w:h="16837.7952755905498634092509746551513671875"/>
+          <w:pgSz w:orient="portrait" w:w="11905.511811023622" w:h="16837.79527559055"/>
           <w:pgMar w:top="2160" w:right="1440" w:bottom="1440" w:left="2160" w:header="720" w:footer="720" w:gutter="0"/>
           <w:cols w:num="1" w:space="720"/>
         </w:sectPr>
@@ -1056,15 +1050,11 @@
     </w:p>
     <w:p>
       <w:pPr>
-        <w:spacing w:line="360" w:lineRule="auto"/>
-      </w:pPr>
-      <w:r>
-        <w:rPr>
-          <w:rFonts w:ascii="TH Sarabun New" w:hAnsi="TH Sarabun New" w:eastAsia="TH Sarabun New" w:cs="TH Sarabun New"/>
-          <w:sz w:val="36"/>
-          <w:szCs w:val="36"/>
-          <w:b w:val="1"/>
-          <w:bCs w:val="1"/>
+        <w:pStyle w:val="SubsectionHeading"/>
+      </w:pPr>
+      <w:r>
+        <w:rPr>
+          <w:rStyle w:val="SubsectionTitleFont"/>
         </w:rPr>
         <w:t xml:space="preserve">${chapter_number}.${subsection_index} ${subsection_title}</w:t>
       </w:r>
@@ -1102,7 +1092,7 @@
     <w:p>
       <w:pPr>
         <w:sectPr>
-          <w:pgSz w:orient="portrait" w:w="11905.511811023621703498065471649169921875" w:h="16837.7952755905498634092509746551513671875"/>
+          <w:pgSz w:orient="portrait" w:w="11905.511811023622" w:h="16837.79527559055"/>
           <w:pgMar w:top="2160" w:right="1440" w:bottom="1440" w:left="2160" w:header="720" w:footer="720" w:gutter="0"/>
           <w:cols w:num="1" w:space="720"/>
         </w:sectPr>
@@ -1148,7 +1138,7 @@
     <w:p>
       <w:pPr>
         <w:sectPr>
-          <w:pgSz w:orient="portrait" w:w="11905.511811023621703498065471649169921875" w:h="16837.7952755905498634092509746551513671875"/>
+          <w:pgSz w:orient="portrait" w:w="11905.511811023622" w:h="16837.79527559055"/>
           <w:pgMar w:top="2160" w:right="1440" w:bottom="1440" w:left="2160" w:header="720" w:footer="720" w:gutter="0"/>
           <w:cols w:num="1" w:space="720"/>
         </w:sectPr>
@@ -1180,7 +1170,7 @@
     <w:p>
       <w:pPr>
         <w:sectPr>
-          <w:pgSz w:orient="portrait" w:w="11905.511811023621703498065471649169921875" w:h="16837.7952755905498634092509746551513671875"/>
+          <w:pgSz w:orient="portrait" w:w="11905.511811023622" w:h="16837.79527559055"/>
           <w:pgMar w:top="2160" w:right="1440" w:bottom="1440" w:left="2160" w:header="720" w:footer="720" w:gutter="0"/>
           <w:cols w:num="1" w:space="720"/>
         </w:sectPr>
@@ -1212,7 +1202,7 @@
     <w:p>
       <w:pPr>
         <w:sectPr>
-          <w:pgSz w:orient="portrait" w:w="11905.511811023621703498065471649169921875" w:h="16837.7952755905498634092509746551513671875"/>
+          <w:pgSz w:orient="portrait" w:w="11905.511811023622" w:h="16837.79527559055"/>
           <w:pgMar w:top="2160" w:right="1440" w:bottom="1440" w:left="2160" w:header="720" w:footer="720" w:gutter="0"/>
           <w:cols w:num="1" w:space="720"/>
         </w:sectPr>
@@ -1256,7 +1246,7 @@
       </w:r>
     </w:p>
     <w:sectPr>
-      <w:pgSz w:orient="portrait" w:w="11905.511811023621703498065471649169921875" w:h="16837.7952755905498634092509746551513671875"/>
+      <w:pgSz w:orient="portrait" w:w="11905.511811023622" w:h="16837.79527559055"/>
       <w:pgMar w:top="2160" w:right="1440" w:bottom="1440" w:left="2160" w:header="720" w:footer="720" w:gutter="0"/>
       <w:cols w:num="1" w:space="720"/>
     </w:sectPr>
@@ -1277,7 +1267,7 @@
   <w:docDefaults>
     <w:rPrDefault>
       <w:rPr>
-        <w:rFonts w:ascii="TH Sarabun New" w:hAnsi="TH Sarabun New" w:eastAsia="Arial" w:cs="TH Sarabun New"/>
+        <w:rFonts w:ascii="TH SarabunPSK" w:hAnsi="TH SarabunPSK" w:eastAsia="Arial" w:cs="TH SarabunPSK"/>
         <w:color w:val="000000"/>
         <w:sz w:val="32"/>
         <w:szCs w:val="32"/>
@@ -1391,7 +1381,7 @@
   <w:style w:type="character">
     <w:name w:val="Heading1Font"/>
     <w:rPr>
-      <w:rFonts w:ascii="TH Sarabun New" w:hAnsi="TH Sarabun New" w:eastAsia="TH Sarabun New" w:cs="TH Sarabun New" w:hint="cs"/>
+      <w:rFonts w:ascii="TH SarabunPSK" w:hAnsi="TH SarabunPSK" w:eastAsia="TH SarabunPSK" w:cs="TH SarabunPSK" w:hint="cs"/>
       <w:sz w:val="40"/>
       <w:szCs w:val="40"/>
       <w:b w:val="1"/>
@@ -1401,7 +1391,7 @@
   <w:style w:type="character">
     <w:name w:val="CoverTitleFont"/>
     <w:rPr>
-      <w:rFonts w:ascii="TH Sarabun New" w:hAnsi="TH Sarabun New" w:eastAsia="TH Sarabun New" w:cs="TH Sarabun New" w:hint="cs"/>
+      <w:rFonts w:ascii="TH SarabunPSK" w:hAnsi="TH SarabunPSK" w:eastAsia="TH SarabunPSK" w:cs="TH SarabunPSK" w:hint="cs"/>
       <w:sz w:val="48"/>
       <w:szCs w:val="48"/>
       <w:b w:val="1"/>
@@ -1411,7 +1401,7 @@
   <w:style w:type="character">
     <w:name w:val="CoverFont"/>
     <w:rPr>
-      <w:rFonts w:ascii="TH Sarabun New" w:hAnsi="TH Sarabun New" w:eastAsia="TH Sarabun New" w:cs="TH Sarabun New" w:hint="cs"/>
+      <w:rFonts w:ascii="TH SarabunPSK" w:hAnsi="TH SarabunPSK" w:eastAsia="TH SarabunPSK" w:cs="TH SarabunPSK" w:hint="cs"/>
       <w:sz w:val="36"/>
       <w:szCs w:val="36"/>
       <w:b w:val="1"/>
@@ -1421,7 +1411,7 @@
   <w:style w:type="character">
     <w:name w:val="NormalFont"/>
     <w:rPr>
-      <w:rFonts w:ascii="TH Sarabun New" w:hAnsi="TH Sarabun New" w:eastAsia="TH Sarabun New" w:cs="TH Sarabun New" w:hint="cs"/>
+      <w:rFonts w:ascii="TH SarabunPSK" w:hAnsi="TH SarabunPSK" w:eastAsia="TH SarabunPSK" w:cs="TH SarabunPSK" w:hint="cs"/>
       <w:sz w:val="32"/>
       <w:szCs w:val="32"/>
     </w:rPr>
@@ -1429,7 +1419,7 @@
   <w:style w:type="character">
     <w:name w:val="NormalBoldFont"/>
     <w:rPr>
-      <w:rFonts w:ascii="TH Sarabun New" w:hAnsi="TH Sarabun New" w:eastAsia="TH Sarabun New" w:cs="TH Sarabun New" w:hint="cs"/>
+      <w:rFonts w:ascii="TH SarabunPSK" w:hAnsi="TH SarabunPSK" w:eastAsia="TH SarabunPSK" w:cs="TH SarabunPSK" w:hint="cs"/>
       <w:sz w:val="32"/>
       <w:szCs w:val="32"/>
       <w:b w:val="1"/>
@@ -1439,7 +1429,7 @@
   <w:style w:type="character">
     <w:name w:val="PrefaceTitleFont"/>
     <w:rPr>
-      <w:rFonts w:ascii="TH Sarabun New" w:hAnsi="TH Sarabun New" w:eastAsia="TH Sarabun New" w:cs="TH Sarabun New" w:hint="cs"/>
+      <w:rFonts w:ascii="TH SarabunPSK" w:hAnsi="TH SarabunPSK" w:eastAsia="TH SarabunPSK" w:cs="TH SarabunPSK" w:hint="cs"/>
       <w:sz w:val="36"/>
       <w:szCs w:val="36"/>
       <w:b w:val="1"/>
@@ -1449,12 +1439,31 @@
   <w:style w:type="character">
     <w:name w:val="TOCLabelFont"/>
     <w:rPr>
-      <w:rFonts w:ascii="TH Sarabun New" w:hAnsi="TH Sarabun New" w:eastAsia="TH Sarabun New" w:cs="TH Sarabun New" w:hint="cs"/>
+      <w:rFonts w:ascii="TH SarabunPSK" w:hAnsi="TH SarabunPSK" w:eastAsia="TH SarabunPSK" w:cs="TH SarabunPSK" w:hint="cs"/>
       <w:sz w:val="36"/>
       <w:szCs w:val="36"/>
       <w:b w:val="1"/>
       <w:bCs w:val="1"/>
     </w:rPr>
+  </w:style>
+  <w:style w:type="character">
+    <w:name w:val="SubsectionTitleFont"/>
+    <w:rPr>
+      <w:rFonts w:ascii="TH SarabunPSK" w:hAnsi="TH SarabunPSK" w:eastAsia="TH SarabunPSK" w:cs="TH SarabunPSK" w:hint="cs"/>
+      <w:sz w:val="36"/>
+      <w:szCs w:val="36"/>
+      <w:b w:val="1"/>
+      <w:bCs w:val="1"/>
+    </w:rPr>
+  </w:style>
+  <w:style w:type="paragraph" w:customStyle="1" w:styleId="SubsectionHeading">
+    <w:name w:val="SubsectionHeading"/>
+    <w:basedOn w:val="Normal"/>
+    <w:pPr>
+      <w:jc w:val="left"/>
+      <w:ind w:left="0" w:right="0" w:firstLine="0" w:hanging="0"/>
+      <w:spacing w:line="288" w:lineRule="auto"/>
+    </w:pPr>
   </w:style>
 </w:styles>
 </file>

</xml_diff>

<commit_message>
style: change alignment to THAI_DISTRIBUTE for better Thai text flow in Word
</commit_message>
<xml_diff>
--- a/assets/templates/template_academic_research.docx
+++ b/assets/templates/template_academic_research.docx
@@ -93,7 +93,7 @@
     <w:p>
       <w:pPr>
         <w:sectPr>
-          <w:pgSz w:orient="portrait" w:w="11905.511811023622" w:h="16837.79527559055"/>
+          <w:pgSz w:orient="portrait" w:w="11905.511811023621703498065471649169921875" w:h="16837.7952755905498634092509746551513671875"/>
           <w:pgMar w:top="2160" w:right="1440" w:bottom="1440" w:left="2160" w:header="720" w:footer="720" w:gutter="0"/>
           <w:cols w:num="1" w:space="720"/>
         </w:sectPr>
@@ -113,7 +113,7 @@
     <w:p>
       <w:pPr>
         <w:sectPr>
-          <w:pgSz w:orient="portrait" w:w="11905.511811023622" w:h="16837.79527559055"/>
+          <w:pgSz w:orient="portrait" w:w="11905.511811023621703498065471649169921875" w:h="16837.7952755905498634092509746551513671875"/>
           <w:pgMar w:top="2160" w:right="1440" w:bottom="1440" w:left="2160" w:header="720" w:footer="720" w:gutter="0"/>
           <w:cols w:num="1" w:space="720"/>
         </w:sectPr>
@@ -210,7 +210,7 @@
     <w:p>
       <w:pPr>
         <w:sectPr>
-          <w:pgSz w:orient="portrait" w:w="11905.511811023622" w:h="16837.79527559055"/>
+          <w:pgSz w:orient="portrait" w:w="11905.511811023621703498065471649169921875" w:h="16837.7952755905498634092509746551513671875"/>
           <w:pgMar w:top="2160" w:right="1440" w:bottom="1440" w:left="2160" w:header="720" w:footer="720" w:gutter="0"/>
           <w:cols w:num="1" w:space="720"/>
         </w:sectPr>
@@ -279,7 +279,7 @@
     <w:p>
       <w:pPr>
         <w:sectPr>
-          <w:pgSz w:orient="portrait" w:w="11905.511811023622" w:h="16837.79527559055"/>
+          <w:pgSz w:orient="portrait" w:w="11905.511811023621703498065471649169921875" w:h="16837.7952755905498634092509746551513671875"/>
           <w:pgMar w:top="2160" w:right="1440" w:bottom="1440" w:left="2160" w:header="720" w:footer="720" w:gutter="0"/>
           <w:cols w:num="1" w:space="720"/>
         </w:sectPr>
@@ -518,7 +518,7 @@
     <w:p>
       <w:pPr>
         <w:sectPr>
-          <w:pgSz w:orient="portrait" w:w="11905.511811023622" w:h="16837.79527559055"/>
+          <w:pgSz w:orient="portrait" w:w="11905.511811023621703498065471649169921875" w:h="16837.7952755905498634092509746551513671875"/>
           <w:pgMar w:top="2160" w:right="1440" w:bottom="1440" w:left="2160" w:header="720" w:footer="720" w:gutter="0"/>
           <w:cols w:num="1" w:space="720"/>
         </w:sectPr>
@@ -757,7 +757,7 @@
     <w:p>
       <w:pPr>
         <w:sectPr>
-          <w:pgSz w:orient="portrait" w:w="11905.511811023622" w:h="16837.79527559055"/>
+          <w:pgSz w:orient="portrait" w:w="11905.511811023621703498065471649169921875" w:h="16837.7952755905498634092509746551513671875"/>
           <w:pgMar w:top="2160" w:right="1440" w:bottom="1440" w:left="2160" w:header="720" w:footer="720" w:gutter="0"/>
           <w:cols w:num="1" w:space="720"/>
         </w:sectPr>
@@ -813,7 +813,7 @@
     <w:p>
       <w:pPr>
         <w:sectPr>
-          <w:pgSz w:orient="portrait" w:w="11905.511811023622" w:h="16837.79527559055"/>
+          <w:pgSz w:orient="portrait" w:w="11905.511811023621703498065471649169921875" w:h="16837.7952755905498634092509746551513671875"/>
           <w:pgMar w:top="2160" w:right="1440" w:bottom="1440" w:left="2160" w:header="720" w:footer="720" w:gutter="0"/>
           <w:cols w:num="1" w:space="720"/>
         </w:sectPr>
@@ -883,7 +883,7 @@
     <w:p>
       <w:pPr>
         <w:sectPr>
-          <w:pgSz w:orient="portrait" w:w="11905.511811023622" w:h="16837.79527559055"/>
+          <w:pgSz w:orient="portrait" w:w="11905.511811023621703498065471649169921875" w:h="16837.7952755905498634092509746551513671875"/>
           <w:pgMar w:top="2160" w:right="1440" w:bottom="1440" w:left="2160" w:header="720" w:footer="720" w:gutter="0"/>
           <w:cols w:num="1" w:space="720"/>
         </w:sectPr>
@@ -939,7 +939,7 @@
     <w:p>
       <w:pPr>
         <w:sectPr>
-          <w:pgSz w:orient="portrait" w:w="11905.511811023622" w:h="16837.79527559055"/>
+          <w:pgSz w:orient="portrait" w:w="11905.511811023621703498065471649169921875" w:h="16837.7952755905498634092509746551513671875"/>
           <w:pgMar w:top="2160" w:right="1440" w:bottom="1440" w:left="2160" w:header="720" w:footer="720" w:gutter="0"/>
           <w:cols w:num="1" w:space="720"/>
         </w:sectPr>
@@ -995,7 +995,7 @@
     <w:p>
       <w:pPr>
         <w:sectPr>
-          <w:pgSz w:orient="portrait" w:w="11905.511811023622" w:h="16837.79527559055"/>
+          <w:pgSz w:orient="portrait" w:w="11905.511811023621703498065471649169921875" w:h="16837.7952755905498634092509746551513671875"/>
           <w:pgMar w:top="2160" w:right="1440" w:bottom="1440" w:left="2160" w:header="720" w:footer="720" w:gutter="0"/>
           <w:cols w:num="1" w:space="720"/>
         </w:sectPr>
@@ -1092,7 +1092,7 @@
     <w:p>
       <w:pPr>
         <w:sectPr>
-          <w:pgSz w:orient="portrait" w:w="11905.511811023622" w:h="16837.79527559055"/>
+          <w:pgSz w:orient="portrait" w:w="11905.511811023621703498065471649169921875" w:h="16837.7952755905498634092509746551513671875"/>
           <w:pgMar w:top="2160" w:right="1440" w:bottom="1440" w:left="2160" w:header="720" w:footer="720" w:gutter="0"/>
           <w:cols w:num="1" w:space="720"/>
         </w:sectPr>
@@ -1138,7 +1138,7 @@
     <w:p>
       <w:pPr>
         <w:sectPr>
-          <w:pgSz w:orient="portrait" w:w="11905.511811023622" w:h="16837.79527559055"/>
+          <w:pgSz w:orient="portrait" w:w="11905.511811023621703498065471649169921875" w:h="16837.7952755905498634092509746551513671875"/>
           <w:pgMar w:top="2160" w:right="1440" w:bottom="1440" w:left="2160" w:header="720" w:footer="720" w:gutter="0"/>
           <w:cols w:num="1" w:space="720"/>
         </w:sectPr>
@@ -1170,7 +1170,7 @@
     <w:p>
       <w:pPr>
         <w:sectPr>
-          <w:pgSz w:orient="portrait" w:w="11905.511811023622" w:h="16837.79527559055"/>
+          <w:pgSz w:orient="portrait" w:w="11905.511811023621703498065471649169921875" w:h="16837.7952755905498634092509746551513671875"/>
           <w:pgMar w:top="2160" w:right="1440" w:bottom="1440" w:left="2160" w:header="720" w:footer="720" w:gutter="0"/>
           <w:cols w:num="1" w:space="720"/>
         </w:sectPr>
@@ -1202,7 +1202,7 @@
     <w:p>
       <w:pPr>
         <w:sectPr>
-          <w:pgSz w:orient="portrait" w:w="11905.511811023622" w:h="16837.79527559055"/>
+          <w:pgSz w:orient="portrait" w:w="11905.511811023621703498065471649169921875" w:h="16837.7952755905498634092509746551513671875"/>
           <w:pgMar w:top="2160" w:right="1440" w:bottom="1440" w:left="2160" w:header="720" w:footer="720" w:gutter="0"/>
           <w:cols w:num="1" w:space="720"/>
         </w:sectPr>
@@ -1246,7 +1246,7 @@
       </w:r>
     </w:p>
     <w:sectPr>
-      <w:pgSz w:orient="portrait" w:w="11905.511811023622" w:h="16837.79527559055"/>
+      <w:pgSz w:orient="portrait" w:w="11905.511811023621703498065471649169921875" w:h="16837.7952755905498634092509746551513671875"/>
       <w:pgMar w:top="2160" w:right="1440" w:bottom="1440" w:left="2160" w:header="720" w:footer="720" w:gutter="0"/>
       <w:cols w:num="1" w:space="720"/>
     </w:sectPr>
@@ -1290,7 +1290,7 @@
     <w:name w:val="AcademicBody"/>
     <w:basedOn w:val="Normal"/>
     <w:pPr>
-      <w:jc w:val="left"/>
+      <w:jc w:val="thaiDistribute"/>
       <w:ind w:left="0" w:right="0" w:firstLine="740" w:hanging="0"/>
       <w:spacing w:after="120" w:line="360" w:lineRule="auto"/>
     </w:pPr>
@@ -1299,7 +1299,7 @@
     <w:name w:val="AcademicBodyNoIndent"/>
     <w:basedOn w:val="Normal"/>
     <w:pPr>
-      <w:jc w:val="left"/>
+      <w:jc w:val="thaiDistribute"/>
       <w:ind w:left="0" w:right="0" w:firstLine="0" w:hanging="0"/>
       <w:spacing w:after="120" w:line="360" w:lineRule="auto"/>
     </w:pPr>

</xml_diff>

<commit_message>
feat: implement structured biography and update research sample data autofill
</commit_message>
<xml_diff>
--- a/assets/templates/template_academic_research.docx
+++ b/assets/templates/template_academic_research.docx
@@ -1119,11 +1119,11 @@
     </w:p>
     <w:p>
       <w:pPr>
-        <w:pStyle w:val="AcademicBody"/>
-      </w:pPr>
-      <w:r>
-        <w:rPr>
-          <w:rStyle w:val="NormalFont"/>
+        <w:pStyle w:val="BibliographyEntry"/>
+      </w:pPr>
+      <w:r>
+        <w:rPr>
+          <w:rStyle w:val="BibliographyFont"/>
         </w:rPr>
         <w:t xml:space="preserve">${bib_content}</w:t>
       </w:r>
@@ -1144,27 +1144,25 @@
         </w:sectPr>
       </w:pPr>
     </w:p>
-    <w:p>
-      <w:pPr>
-        <w:pStyle w:val="PrefaceParaTitle"/>
-      </w:pPr>
-      <w:r>
-        <w:rPr>
-          <w:rStyle w:val="PrefaceTitleFont"/>
-        </w:rPr>
-        <w:t xml:space="preserve">ภาคผนวก ก</w:t>
-      </w:r>
-    </w:p>
-    <w:p/>
-    <w:p>
-      <w:pPr>
-        <w:pStyle w:val="AcademicBody"/>
-      </w:pPr>
-      <w:r>
-        <w:rPr>
-          <w:rStyle w:val="NormalFont"/>
-        </w:rPr>
-        <w:t xml:space="preserve">[ส่วนสำหรับแทรกเนื้อหาภาคผนวก ก]</w:t>
+    <w:p/>
+    <w:p/>
+    <w:p/>
+    <w:p/>
+    <w:p/>
+    <w:p/>
+    <w:p/>
+    <w:p/>
+    <w:p/>
+    <w:p/>
+    <w:p>
+      <w:pPr>
+        <w:pStyle w:val="AppendixCenterPara"/>
+      </w:pPr>
+      <w:r>
+        <w:rPr>
+          <w:rStyle w:val="AppendixItemFont"/>
+        </w:rPr>
+        <w:t xml:space="preserve">ภาคผนวก</w:t>
       </w:r>
     </w:p>
     <w:p>
@@ -1176,27 +1174,37 @@
         </w:sectPr>
       </w:pPr>
     </w:p>
-    <w:p>
-      <w:pPr>
-        <w:pStyle w:val="PrefaceParaTitle"/>
-      </w:pPr>
-      <w:r>
-        <w:rPr>
-          <w:rStyle w:val="PrefaceTitleFont"/>
-        </w:rPr>
-        <w:t xml:space="preserve">ภาคผนวก ข</w:t>
-      </w:r>
-    </w:p>
-    <w:p/>
-    <w:p>
-      <w:pPr>
-        <w:pStyle w:val="AcademicBody"/>
-      </w:pPr>
-      <w:r>
-        <w:rPr>
-          <w:rStyle w:val="NormalFont"/>
-        </w:rPr>
-        <w:t xml:space="preserve">[ส่วนสำหรับแทรกเนื้อหาภาคผนวก ข]</w:t>
+    <w:p/>
+    <w:p/>
+    <w:p/>
+    <w:p/>
+    <w:p/>
+    <w:p/>
+    <w:p/>
+    <w:p/>
+    <w:p/>
+    <w:p/>
+    <w:p>
+      <w:pPr>
+        <w:pStyle w:val="AppendixCenterPara"/>
+      </w:pPr>
+      <w:r>
+        <w:rPr>
+          <w:rStyle w:val="AppendixItemFont"/>
+        </w:rPr>
+        <w:t xml:space="preserve">${appendix_a_title}</w:t>
+      </w:r>
+    </w:p>
+    <w:p/>
+    <w:p>
+      <w:pPr>
+        <w:pStyle w:val="AppendixCenterPara"/>
+      </w:pPr>
+      <w:r>
+        <w:rPr>
+          <w:rStyle w:val="AppendixItemFont"/>
+        </w:rPr>
+        <w:t xml:space="preserve">${appendix_a_content}</w:t>
       </w:r>
     </w:p>
     <w:p>
@@ -1208,6 +1216,48 @@
         </w:sectPr>
       </w:pPr>
     </w:p>
+    <w:p/>
+    <w:p/>
+    <w:p/>
+    <w:p/>
+    <w:p/>
+    <w:p/>
+    <w:p/>
+    <w:p/>
+    <w:p/>
+    <w:p/>
+    <w:p>
+      <w:pPr>
+        <w:pStyle w:val="AppendixCenterPara"/>
+      </w:pPr>
+      <w:r>
+        <w:rPr>
+          <w:rStyle w:val="AppendixItemFont"/>
+        </w:rPr>
+        <w:t xml:space="preserve">${appendix_b_title}</w:t>
+      </w:r>
+    </w:p>
+    <w:p/>
+    <w:p>
+      <w:pPr>
+        <w:pStyle w:val="AppendixCenterPara"/>
+      </w:pPr>
+      <w:r>
+        <w:rPr>
+          <w:rStyle w:val="AppendixItemFont"/>
+        </w:rPr>
+        <w:t xml:space="preserve">${appendix_b_content}</w:t>
+      </w:r>
+    </w:p>
+    <w:p>
+      <w:pPr>
+        <w:sectPr>
+          <w:pgSz w:orient="portrait" w:w="11905.511811023621703498065471649169921875" w:h="16837.7952755905498634092509746551513671875"/>
+          <w:pgMar w:top="2160" w:right="1440" w:bottom="1440" w:left="2160" w:header="720" w:footer="720" w:gutter="0"/>
+          <w:cols w:num="1" w:space="720"/>
+        </w:sectPr>
+      </w:pPr>
+    </w:p>
     <w:p>
       <w:pPr>
         <w:pStyle w:val="PrefaceParaTitle"/>
@@ -1216,35 +1266,206 @@
         <w:rPr>
           <w:rStyle w:val="PrefaceTitleFont"/>
         </w:rPr>
-        <w:t xml:space="preserve">ประวัติผู้วิจัย</w:t>
-      </w:r>
-    </w:p>
-    <w:p/>
-    <w:p>
-      <w:pPr/>
-      <w:r>
-        <w:rPr/>
-        <w:t xml:space="preserve">${bio_paras}</w:t>
-      </w:r>
-    </w:p>
-    <w:p>
-      <w:pPr>
-        <w:pStyle w:val="AcademicBody"/>
-      </w:pPr>
-      <w:r>
-        <w:rPr>
-          <w:rStyle w:val="NormalFont"/>
-        </w:rPr>
-        <w:t xml:space="preserve">${bio_text}</w:t>
-      </w:r>
-    </w:p>
-    <w:p>
-      <w:pPr/>
-      <w:r>
-        <w:rPr/>
-        <w:t xml:space="preserve">${/bio_paras}</w:t>
-      </w:r>
-    </w:p>
+        <w:t xml:space="preserve">ประวัติผู้ศึกษา</w:t>
+      </w:r>
+    </w:p>
+    <w:p/>
+    <w:tbl>
+      <w:tblGrid>
+        <w:gridCol w:w="2000" w:type="dxa"/>
+        <w:gridCol w:w="7500" w:type="dxa"/>
+      </w:tblGrid>
+      <w:tblPr>
+        <w:jc w:val="start"/>
+        <w:tblW w:w="0" w:type="auto"/>
+        <w:tblLayout w:type="autofit"/>
+      </w:tblPr>
+      <w:tr>
+        <w:trPr/>
+        <w:tc>
+          <w:tcPr>
+            <w:tcW w:w="2000" w:type="dxa"/>
+            <w:noWrap/>
+          </w:tcPr>
+          <w:p>
+            <w:pPr>
+              <w:spacing w:after="180"/>
+            </w:pPr>
+            <w:r>
+              <w:rPr>
+                <w:rStyle w:val="NormalBoldFont"/>
+              </w:rPr>
+              <w:t xml:space="preserve">ชื่อ-นามสกุล:</w:t>
+            </w:r>
+          </w:p>
+        </w:tc>
+        <w:tc>
+          <w:tcPr>
+            <w:tcW w:w="7500" w:type="dxa"/>
+            <w:noWrap/>
+          </w:tcPr>
+          <w:p>
+            <w:pPr>
+              <w:spacing w:after="180"/>
+            </w:pPr>
+            <w:r>
+              <w:rPr>
+                <w:rStyle w:val="NormalFont"/>
+              </w:rPr>
+              <w:t xml:space="preserve">${bio_name}</w:t>
+            </w:r>
+          </w:p>
+        </w:tc>
+      </w:tr>
+      <w:tr>
+        <w:trPr/>
+        <w:tc>
+          <w:tcPr>
+            <w:tcW w:w="2000" w:type="dxa"/>
+            <w:noWrap/>
+          </w:tcPr>
+          <w:p>
+            <w:pPr>
+              <w:spacing w:after="180"/>
+            </w:pPr>
+            <w:r>
+              <w:rPr>
+                <w:rStyle w:val="NormalBoldFont"/>
+              </w:rPr>
+              <w:t xml:space="preserve">วัน/เดือน/ปีเกิด:</w:t>
+            </w:r>
+          </w:p>
+        </w:tc>
+        <w:tc>
+          <w:tcPr>
+            <w:tcW w:w="7500" w:type="dxa"/>
+            <w:noWrap/>
+          </w:tcPr>
+          <w:p>
+            <w:pPr>
+              <w:spacing w:after="180"/>
+            </w:pPr>
+            <w:r>
+              <w:rPr>
+                <w:rStyle w:val="NormalFont"/>
+              </w:rPr>
+              <w:t xml:space="preserve">${bio_dob}</w:t>
+            </w:r>
+          </w:p>
+        </w:tc>
+      </w:tr>
+      <w:tr>
+        <w:trPr/>
+        <w:tc>
+          <w:tcPr>
+            <w:tcW w:w="2000" w:type="dxa"/>
+            <w:noWrap/>
+          </w:tcPr>
+          <w:p>
+            <w:pPr>
+              <w:spacing w:after="180"/>
+            </w:pPr>
+            <w:r>
+              <w:rPr>
+                <w:rStyle w:val="NormalBoldFont"/>
+              </w:rPr>
+              <w:t xml:space="preserve">ภูมิลำเนา:</w:t>
+            </w:r>
+          </w:p>
+        </w:tc>
+        <w:tc>
+          <w:tcPr>
+            <w:tcW w:w="7500" w:type="dxa"/>
+            <w:noWrap/>
+          </w:tcPr>
+          <w:p>
+            <w:pPr>
+              <w:spacing w:after="180"/>
+            </w:pPr>
+            <w:r>
+              <w:rPr>
+                <w:rStyle w:val="NormalFont"/>
+              </w:rPr>
+              <w:t xml:space="preserve">${bio_domicile}</w:t>
+            </w:r>
+          </w:p>
+        </w:tc>
+      </w:tr>
+      <w:tr>
+        <w:trPr/>
+        <w:tc>
+          <w:tcPr>
+            <w:tcW w:w="2000" w:type="dxa"/>
+            <w:noWrap/>
+          </w:tcPr>
+          <w:p>
+            <w:pPr>
+              <w:spacing w:after="180"/>
+            </w:pPr>
+            <w:r>
+              <w:rPr>
+                <w:rStyle w:val="NormalBoldFont"/>
+              </w:rPr>
+              <w:t xml:space="preserve">การติดต่อ:</w:t>
+            </w:r>
+          </w:p>
+        </w:tc>
+        <w:tc>
+          <w:tcPr>
+            <w:tcW w:w="7500" w:type="dxa"/>
+            <w:noWrap/>
+          </w:tcPr>
+          <w:p>
+            <w:pPr>
+              <w:spacing w:after="180"/>
+            </w:pPr>
+            <w:r>
+              <w:rPr>
+                <w:rStyle w:val="NormalFont"/>
+              </w:rPr>
+              <w:t xml:space="preserve">${bio_contact}</w:t>
+            </w:r>
+          </w:p>
+        </w:tc>
+      </w:tr>
+      <w:tr>
+        <w:trPr/>
+        <w:tc>
+          <w:tcPr>
+            <w:tcW w:w="2000" w:type="dxa"/>
+            <w:noWrap/>
+          </w:tcPr>
+          <w:p>
+            <w:pPr>
+              <w:spacing w:after="180"/>
+            </w:pPr>
+            <w:r>
+              <w:rPr>
+                <w:rStyle w:val="NormalBoldFont"/>
+              </w:rPr>
+              <w:t xml:space="preserve">ประวัติการศึกษา:</w:t>
+            </w:r>
+          </w:p>
+        </w:tc>
+        <w:tc>
+          <w:tcPr>
+            <w:tcW w:w="7500" w:type="dxa"/>
+            <w:noWrap/>
+          </w:tcPr>
+          <w:p>
+            <w:pPr>
+              <w:spacing w:after="180"/>
+            </w:pPr>
+            <w:r>
+              <w:rPr>
+                <w:rStyle w:val="NormalFont"/>
+              </w:rPr>
+              <w:t xml:space="preserve">${bio_edu_details}</w:t>
+            </w:r>
+          </w:p>
+        </w:tc>
+      </w:tr>
+    </w:tbl>
     <w:sectPr>
       <w:pgSz w:orient="portrait" w:w="11905.511811023621703498065471649169921875" w:h="16837.7952755905498634092509746551513671875"/>
       <w:pgMar w:top="2160" w:right="1440" w:bottom="1440" w:left="2160" w:header="720" w:footer="720" w:gutter="0"/>
@@ -1304,6 +1525,15 @@
       <w:spacing w:after="120" w:line="360" w:lineRule="auto"/>
     </w:pPr>
   </w:style>
+  <w:style w:type="paragraph" w:customStyle="1" w:styleId="BibliographyEntry">
+    <w:name w:val="BibliographyEntry"/>
+    <w:basedOn w:val="Normal"/>
+    <w:pPr>
+      <w:jc w:val="left"/>
+      <w:ind w:left="740" w:right="0" w:firstLine="0" w:hanging="740"/>
+      <w:spacing w:after="120" w:line="360" w:lineRule="auto"/>
+    </w:pPr>
+  </w:style>
   <w:style w:type="paragraph" w:customStyle="1" w:styleId="Heading1">
     <w:name w:val="Heading1"/>
     <w:basedOn w:val="Normal"/>
@@ -1417,6 +1647,16 @@
     </w:rPr>
   </w:style>
   <w:style w:type="character">
+    <w:name w:val="BibliographyFont"/>
+    <w:rPr>
+      <w:rFonts w:ascii="TH SarabunPSK" w:hAnsi="TH SarabunPSK" w:eastAsia="TH SarabunPSK" w:cs="TH SarabunPSK" w:hint="cs"/>
+      <w:sz w:val="32"/>
+      <w:szCs w:val="32"/>
+      <w:i w:val="1"/>
+      <w:iCs w:val="1"/>
+    </w:rPr>
+  </w:style>
+  <w:style w:type="character">
     <w:name w:val="NormalBoldFont"/>
     <w:rPr>
       <w:rFonts w:ascii="TH SarabunPSK" w:hAnsi="TH SarabunPSK" w:eastAsia="TH SarabunPSK" w:cs="TH SarabunPSK" w:hint="cs"/>
@@ -1445,6 +1685,24 @@
       <w:b w:val="1"/>
       <w:bCs w:val="1"/>
     </w:rPr>
+  </w:style>
+  <w:style w:type="character">
+    <w:name w:val="AppendixItemFont"/>
+    <w:rPr>
+      <w:rFonts w:ascii="TH SarabunPSK" w:hAnsi="TH SarabunPSK" w:eastAsia="TH SarabunPSK" w:cs="TH SarabunPSK" w:hint="cs"/>
+      <w:sz w:val="36"/>
+      <w:szCs w:val="36"/>
+      <w:b w:val="1"/>
+      <w:bCs w:val="1"/>
+    </w:rPr>
+  </w:style>
+  <w:style w:type="paragraph" w:customStyle="1" w:styleId="AppendixCenterPara">
+    <w:name w:val="AppendixCenterPara"/>
+    <w:basedOn w:val="Normal"/>
+    <w:pPr>
+      <w:jc w:val="center"/>
+      <w:spacing w:line="240" w:lineRule="auto"/>
+    </w:pPr>
   </w:style>
   <w:style w:type="character">
     <w:name w:val="SubsectionTitleFont"/>

</xml_diff>